<commit_message>
Updated the structure for non trainee's letters
</commit_message>
<xml_diff>
--- a/samples/Appointment Letter and Training Agreement.docx
+++ b/samples/Appointment Letter and Training Agreement.docx
@@ -173,37 +173,12 @@
       <w:r>
         <w:t xml:space="preserve"> with </w:t>
       </w:r>
-      <w:proofErr w:type="spellStart"/>
-      <w:r>
-        <w:rPr>
-          <w:b/>
-          <w:bCs/>
-        </w:rPr>
-        <w:t>InTimeTec</w:t>
-      </w:r>
-      <w:proofErr w:type="spellEnd"/>
-      <w:r>
-        <w:rPr>
-          <w:b/>
-          <w:bCs/>
-        </w:rPr>
-        <w:t xml:space="preserve"> </w:t>
-      </w:r>
-      <w:proofErr w:type="spellStart"/>
-      <w:r>
-        <w:rPr>
-          <w:b/>
-          <w:bCs/>
-        </w:rPr>
-        <w:t>VisionSoft</w:t>
-      </w:r>
-      <w:proofErr w:type="spellEnd"/>
-      <w:r>
-        <w:rPr>
-          <w:b/>
-          <w:bCs/>
-        </w:rPr>
-        <w:t xml:space="preserve"> Private Limited (“</w:t>
+      <w:r>
+        <w:rPr>
+          <w:b/>
+          <w:bCs/>
+        </w:rPr>
+        <w:t>InTimeTec VisionSoft Private Limited (“</w:t>
       </w:r>
       <w:r>
         <w:t xml:space="preserve">Company”), at our </w:t>
@@ -454,21 +429,11 @@
       <w:pPr>
         <w:jc w:val="both"/>
       </w:pPr>
-      <w:proofErr w:type="spellStart"/>
-      <w:r>
-        <w:t>Kalpavriksha</w:t>
-      </w:r>
-      <w:proofErr w:type="spellEnd"/>
-      <w:r>
-        <w:t xml:space="preserve"> training is mandatory. Those who are under the </w:t>
-      </w:r>
-      <w:proofErr w:type="spellStart"/>
-      <w:r>
-        <w:t>Kalpavriksha</w:t>
-      </w:r>
-      <w:proofErr w:type="spellEnd"/>
-      <w:r>
-        <w:t xml:space="preserve"> Program must successfully pass at least two (2) out of the three (3) assessments. Failure to meet this requirement will result in automatic discontinuation of the training, with no further obligation on the part of the Company.</w:t>
+      <w:r>
+        <w:rPr>
+          <w:highlight w:val="green"/>
+        </w:rPr>
+        <w:t>Kalpavriksha training is mandatory. Those who are under the Kalpavriksha Program must successfully pass at least two (2) out of the three (3) assessments. Failure to meet this requirement will result in automatic discontinuation of the training, with no further obligation on the part of the Company.</w:t>
       </w:r>
     </w:p>
     <w:p>
@@ -1669,7 +1634,16 @@
         <w:jc w:val="both"/>
       </w:pPr>
       <w:r>
-        <w:t xml:space="preserve">In the event that you resign from the services of the Company during the training period, you will be required to repay the company a sum total of the amount you have received as stipend starting from the date you joined the company. Additionally, you shall be required to serve a 15(fifteen) days prior notice period to the Company or pay an amount equivalent to 15 (fifteen) days salary/remuneration in lieu thereof prior to leaving the services of the Company. Similarly, if the Company decides to discontinue your services during the probation period or training period, it may do so by providing you with 15 (fifteen) days prior notice or payment of a sum equivalent to your 15 (fifteen) days salary/remuneration in lieu of the notice period as per management discretion.  </w:t>
+        <w:t xml:space="preserve">In the event that you resign from the services of the Company during the training period, you will be required to repay the company a sum total of the amount you have received as stipend starting from the date you joined the company. Additionally, you shall be required to serve a 15(fifteen) days prior notice period to the Company or </w:t>
+      </w:r>
+      <w:r>
+        <w:t>subject to management approval</w:t>
+      </w:r>
+      <w:r>
+        <w:t xml:space="preserve"> </w:t>
+      </w:r>
+      <w:r>
+        <w:t xml:space="preserve">pay an amount equivalent to 15 (fifteen) days salary/remuneration in lieu thereof prior to leaving the services of the Company. Similarly, if the Company decides to discontinue your services during the probation period or training period, it may do so by providing you with 15 (fifteen) days prior notice or payment of a sum equivalent to your 15 (fifteen) days salary/remuneration in lieu of the notice period as per management discretion.  </w:t>
       </w:r>
     </w:p>
     <w:p>
@@ -2171,6 +2145,16 @@
     <w:p>
       <w:pPr>
         <w:jc w:val="both"/>
+      </w:pPr>
+    </w:p>
+    <w:p>
+      <w:pPr>
+        <w:jc w:val="both"/>
+      </w:pPr>
+    </w:p>
+    <w:p>
+      <w:pPr>
+        <w:jc w:val="both"/>
         <w:rPr>
           <w:b/>
           <w:bCs/>
@@ -2197,6 +2181,7 @@
           <w:bCs/>
           <w:u w:val="single"/>
         </w:rPr>
+        <w:lastRenderedPageBreak/>
         <w:t>Notices</w:t>
       </w:r>
     </w:p>
@@ -2228,7 +2213,6 @@
           <w:sz w:val="22"/>
           <w:szCs w:val="22"/>
         </w:rPr>
-        <w:lastRenderedPageBreak/>
         <w:t>All</w:t>
       </w:r>
       <w:r>
@@ -2486,38 +2470,6 @@
         </w:rPr>
         <w:t>duly</w:t>
       </w:r>
-      <w:r>
-        <w:rPr>
-          <w:spacing w:val="-14"/>
-          <w:sz w:val="22"/>
-          <w:szCs w:val="22"/>
-        </w:rPr>
-        <w:t xml:space="preserve"> </w:t>
-      </w:r>
-    </w:p>
-    <w:p>
-      <w:pPr>
-        <w:pStyle w:val="BodyText"/>
-        <w:spacing w:line="242" w:lineRule="auto"/>
-        <w:jc w:val="both"/>
-        <w:rPr>
-          <w:spacing w:val="-14"/>
-          <w:sz w:val="22"/>
-          <w:szCs w:val="22"/>
-        </w:rPr>
-      </w:pPr>
-    </w:p>
-    <w:p>
-      <w:pPr>
-        <w:pStyle w:val="BodyText"/>
-        <w:spacing w:line="242" w:lineRule="auto"/>
-        <w:jc w:val="both"/>
-        <w:rPr>
-          <w:spacing w:val="-14"/>
-          <w:sz w:val="22"/>
-          <w:szCs w:val="22"/>
-        </w:rPr>
-      </w:pPr>
     </w:p>
     <w:p>
       <w:pPr>
@@ -2875,7 +2827,10 @@
         <w:t xml:space="preserve"> the </w:t>
       </w:r>
       <w:r>
-        <w:t>Trainee</w:t>
+        <w:t>t</w:t>
+      </w:r>
+      <w:r>
+        <w:t>rainee</w:t>
       </w:r>
       <w:r>
         <w:t xml:space="preserve"> from</w:t>
@@ -3194,23 +3149,7 @@
         <w:jc w:val="both"/>
       </w:pPr>
       <w:r>
-        <w:t xml:space="preserve">Please sign and return a copy of this Appointment Letter and Training Agreement on the same day you receive this document. We look forward to welcoming you to </w:t>
-      </w:r>
-      <w:proofErr w:type="spellStart"/>
-      <w:r>
-        <w:t>InTimeTec</w:t>
-      </w:r>
-      <w:proofErr w:type="spellEnd"/>
-      <w:r>
-        <w:t xml:space="preserve"> family. By accepting this, </w:t>
-      </w:r>
-      <w:proofErr w:type="gramStart"/>
-      <w:r>
-        <w:t>You</w:t>
-      </w:r>
-      <w:proofErr w:type="gramEnd"/>
-      <w:r>
-        <w:t xml:space="preserve"> confirm that all information provided by you to us is accurate and complete to the best of your knowledge, and that you have not misrepresented or willfully concealed any material information regarding your</w:t>
+        <w:t>Please sign and return a copy of this Appointment Letter and Training Agreement on the same day you receive this document. We look forward to welcoming you to InTimeTec family. By accepting this, You confirm that all information provided by you to us is accurate and complete to the best of your knowledge, and that you have not misrepresented or willfully concealed any material information regarding your</w:t>
       </w:r>
       <w:r>
         <w:t xml:space="preserve"> professional </w:t>
@@ -3259,39 +3198,7 @@
           <w:b/>
           <w:bCs/>
         </w:rPr>
-        <w:t xml:space="preserve">For </w:t>
-      </w:r>
-      <w:proofErr w:type="spellStart"/>
-      <w:r>
-        <w:rPr>
-          <w:b/>
-          <w:bCs/>
-        </w:rPr>
-        <w:t>InTimeTec</w:t>
-      </w:r>
-      <w:proofErr w:type="spellEnd"/>
-      <w:r>
-        <w:rPr>
-          <w:b/>
-          <w:bCs/>
-        </w:rPr>
-        <w:t xml:space="preserve"> </w:t>
-      </w:r>
-      <w:proofErr w:type="spellStart"/>
-      <w:r>
-        <w:rPr>
-          <w:b/>
-          <w:bCs/>
-        </w:rPr>
-        <w:t>VisionSoft</w:t>
-      </w:r>
-      <w:proofErr w:type="spellEnd"/>
-      <w:r>
-        <w:rPr>
-          <w:b/>
-          <w:bCs/>
-        </w:rPr>
-        <w:t xml:space="preserve"> Private Limited</w:t>
+        <w:t>For InTimeTec VisionSoft Private Limited</w:t>
       </w:r>
     </w:p>
     <w:p>
@@ -3758,49 +3665,7 @@
       <w:rPr>
         <w:sz w:val="20"/>
       </w:rPr>
-      <w:t xml:space="preserve"> Registered office: Plot no. ½, </w:t>
-    </w:r>
-    <w:proofErr w:type="spellStart"/>
-    <w:r>
-      <w:rPr>
-        <w:sz w:val="20"/>
-      </w:rPr>
-      <w:t>Kanakpura</w:t>
-    </w:r>
-    <w:proofErr w:type="spellEnd"/>
-    <w:r>
-      <w:rPr>
-        <w:sz w:val="20"/>
-      </w:rPr>
-      <w:t xml:space="preserve"> Industrial Area, </w:t>
-    </w:r>
-    <w:proofErr w:type="spellStart"/>
-    <w:r>
-      <w:rPr>
-        <w:sz w:val="20"/>
-      </w:rPr>
-      <w:t>Kanakpura</w:t>
-    </w:r>
-    <w:proofErr w:type="spellEnd"/>
-    <w:r>
-      <w:rPr>
-        <w:sz w:val="20"/>
-      </w:rPr>
-      <w:t xml:space="preserve">, </w:t>
-    </w:r>
-    <w:proofErr w:type="spellStart"/>
-    <w:r>
-      <w:rPr>
-        <w:sz w:val="20"/>
-      </w:rPr>
-      <w:t>Sirsi</w:t>
-    </w:r>
-    <w:proofErr w:type="spellEnd"/>
-    <w:r>
-      <w:rPr>
-        <w:sz w:val="20"/>
-      </w:rPr>
-      <w:t xml:space="preserve"> Road, Jaipur-302034</w:t>
+      <w:t xml:space="preserve"> Registered office: Plot no. ½, Kanakpura Industrial Area, Kanakpura, Sirsi Road, Jaipur-302034</w:t>
     </w:r>
   </w:p>
   <w:p>
@@ -3816,21 +3681,7 @@
       <w:rPr>
         <w:sz w:val="20"/>
       </w:rPr>
-      <w:t xml:space="preserve">Branch Office: 3rd Floor, Site No.271, Sri Ganesha Complex, Hosur Main Road, </w:t>
-    </w:r>
-    <w:proofErr w:type="spellStart"/>
-    <w:r>
-      <w:rPr>
-        <w:sz w:val="20"/>
-      </w:rPr>
-      <w:t>Madiwala</w:t>
-    </w:r>
-    <w:proofErr w:type="spellEnd"/>
-    <w:r>
-      <w:rPr>
-        <w:sz w:val="20"/>
-      </w:rPr>
-      <w:t>, BTM 1</w:t>
+      <w:t>Branch Office: 3rd Floor, Site No.271, Sri Ganesha Complex, Hosur Main Road, Madiwala, BTM 1</w:t>
     </w:r>
     <w:r>
       <w:rPr>
@@ -4594,6 +4445,7 @@
   <w:style w:type="character" w:default="1" w:styleId="DefaultParagraphFont">
     <w:name w:val="Default Paragraph Font"/>
     <w:uiPriority w:val="1"/>
+    <w:semiHidden/>
     <w:unhideWhenUsed/>
   </w:style>
   <w:style w:type="table" w:default="1" w:styleId="TableNormal">
@@ -5349,30 +5201,6 @@
 </file>
 
 <file path=customXml/item1.xml><?xml version="1.0" encoding="utf-8"?>
-<p:properties xmlns:p="http://schemas.microsoft.com/office/2006/metadata/properties" xmlns:xsi="http://www.w3.org/2001/XMLSchema-instance" xmlns:pc="http://schemas.microsoft.com/office/infopath/2007/PartnerControls">
-  <documentManagement>
-    <TaxCatchAll xmlns="356e901f-47eb-47ce-8e66-808e6286e49f" xsi:nil="true"/>
-    <lcf76f155ced4ddcb4097134ff3c332f xmlns="31ff94d2-d6de-4560-8208-d596f4cc19da">
-      <Terms xmlns="http://schemas.microsoft.com/office/infopath/2007/PartnerControls"/>
-    </lcf76f155ced4ddcb4097134ff3c332f>
-  </documentManagement>
-</p:properties>
-</file>
-
-<file path=customXml/item2.xml><?xml version="1.0" encoding="utf-8"?>
-<?mso-contentType ?>
-<FormTemplates xmlns="http://schemas.microsoft.com/sharepoint/v3/contenttype/forms">
-  <Display>DocumentLibraryForm</Display>
-  <Edit>DocumentLibraryForm</Edit>
-  <New>DocumentLibraryForm</New>
-</FormTemplates>
-</file>
-
-<file path=customXml/item3.xml><?xml version="1.0" encoding="utf-8"?>
-<b:Sources xmlns:b="http://schemas.openxmlformats.org/officeDocument/2006/bibliography" xmlns="http://schemas.openxmlformats.org/officeDocument/2006/bibliography" SelectedStyle="\APASixthEditionOfficeOnline.xsl" StyleName="APA" Version="6"/>
-</file>
-
-<file path=customXml/item4.xml><?xml version="1.0" encoding="utf-8"?>
 <ct:contentTypeSchema xmlns:ct="http://schemas.microsoft.com/office/2006/metadata/contentType" xmlns:ma="http://schemas.microsoft.com/office/2006/metadata/properties/metaAttributes" ct:_="" ma:_="" ma:contentTypeName="Document" ma:contentTypeID="0x010100596F5F72D0BB324FB8D2F90D302CBF8E" ma:contentTypeVersion="14" ma:contentTypeDescription="Create a new document." ma:contentTypeScope="" ma:versionID="51395bf0116c116f07b4204002be72fe">
   <xsd:schema xmlns:xsd="http://www.w3.org/2001/XMLSchema" xmlns:xs="http://www.w3.org/2001/XMLSchema" xmlns:p="http://schemas.microsoft.com/office/2006/metadata/properties" xmlns:ns2="31ff94d2-d6de-4560-8208-d596f4cc19da" xmlns:ns3="356e901f-47eb-47ce-8e66-808e6286e49f" targetNamespace="http://schemas.microsoft.com/office/2006/metadata/properties" ma:root="true" ma:fieldsID="a4c736c3916c2b1e2eff80411f42a817" ns2:_="" ns3:_="">
     <xsd:import namespace="31ff94d2-d6de-4560-8208-d596f4cc19da"/>
@@ -5601,34 +5429,31 @@
 </ct:contentTypeSchema>
 </file>
 
-<file path=customXml/itemProps1.xml><?xml version="1.0" encoding="utf-8"?>
-<ds:datastoreItem xmlns:ds="http://schemas.openxmlformats.org/officeDocument/2006/customXml" ds:itemID="{7883E2C3-CCE1-4717-BE5E-8B1D565F3415}">
-  <ds:schemaRefs>
-    <ds:schemaRef ds:uri="http://schemas.microsoft.com/office/2006/metadata/properties"/>
-    <ds:schemaRef ds:uri="http://schemas.microsoft.com/office/infopath/2007/PartnerControls"/>
-    <ds:schemaRef ds:uri="356e901f-47eb-47ce-8e66-808e6286e49f"/>
-    <ds:schemaRef ds:uri="31ff94d2-d6de-4560-8208-d596f4cc19da"/>
-  </ds:schemaRefs>
-</ds:datastoreItem>
+<file path=customXml/item2.xml><?xml version="1.0" encoding="utf-8"?>
+<b:Sources xmlns:b="http://schemas.openxmlformats.org/officeDocument/2006/bibliography" xmlns="http://schemas.openxmlformats.org/officeDocument/2006/bibliography" SelectedStyle="\APASixthEditionOfficeOnline.xsl" StyleName="APA" Version="6"/>
 </file>
 
-<file path=customXml/itemProps2.xml><?xml version="1.0" encoding="utf-8"?>
-<ds:datastoreItem xmlns:ds="http://schemas.openxmlformats.org/officeDocument/2006/customXml" ds:itemID="{8E9DE294-534C-4BFB-8111-CAF01004D4DD}">
-  <ds:schemaRefs>
-    <ds:schemaRef ds:uri="http://schemas.microsoft.com/sharepoint/v3/contenttype/forms"/>
-  </ds:schemaRefs>
-</ds:datastoreItem>
+<file path=customXml/item3.xml><?xml version="1.0" encoding="utf-8"?>
+<?mso-contentType ?>
+<FormTemplates xmlns="http://schemas.microsoft.com/sharepoint/v3/contenttype/forms">
+  <Display>DocumentLibraryForm</Display>
+  <Edit>DocumentLibraryForm</Edit>
+  <New>DocumentLibraryForm</New>
+</FormTemplates>
 </file>
 
-<file path=customXml/itemProps3.xml><?xml version="1.0" encoding="utf-8"?>
-<ds:datastoreItem xmlns:ds="http://schemas.openxmlformats.org/officeDocument/2006/customXml" ds:itemID="{688DFA95-ED9B-4BF1-9C89-C455323CDB9D}">
-  <ds:schemaRefs>
-    <ds:schemaRef ds:uri="http://schemas.openxmlformats.org/officeDocument/2006/bibliography"/>
-  </ds:schemaRefs>
-</ds:datastoreItem>
+<file path=customXml/item4.xml><?xml version="1.0" encoding="utf-8"?>
+<p:properties xmlns:p="http://schemas.microsoft.com/office/2006/metadata/properties" xmlns:xsi="http://www.w3.org/2001/XMLSchema-instance" xmlns:pc="http://schemas.microsoft.com/office/infopath/2007/PartnerControls">
+  <documentManagement>
+    <TaxCatchAll xmlns="356e901f-47eb-47ce-8e66-808e6286e49f" xsi:nil="true"/>
+    <lcf76f155ced4ddcb4097134ff3c332f xmlns="31ff94d2-d6de-4560-8208-d596f4cc19da">
+      <Terms xmlns="http://schemas.microsoft.com/office/infopath/2007/PartnerControls"/>
+    </lcf76f155ced4ddcb4097134ff3c332f>
+  </documentManagement>
+</p:properties>
 </file>
 
-<file path=customXml/itemProps4.xml><?xml version="1.0" encoding="utf-8"?>
+<file path=customXml/itemProps1.xml><?xml version="1.0" encoding="utf-8"?>
 <ds:datastoreItem xmlns:ds="http://schemas.openxmlformats.org/officeDocument/2006/customXml" ds:itemID="{FE719206-F82B-4EF8-BE41-C47AF4CE56A2}">
   <ds:schemaRefs>
     <ds:schemaRef ds:uri="http://schemas.microsoft.com/office/2006/metadata/contentType"/>
@@ -5645,4 +5470,31 @@
     <ds:schemaRef ds:uri="http://schemas.microsoft.com/internal/obd"/>
   </ds:schemaRefs>
 </ds:datastoreItem>
+</file>
+
+<file path=customXml/itemProps2.xml><?xml version="1.0" encoding="utf-8"?>
+<ds:datastoreItem xmlns:ds="http://schemas.openxmlformats.org/officeDocument/2006/customXml" ds:itemID="{688DFA95-ED9B-4BF1-9C89-C455323CDB9D}">
+  <ds:schemaRefs>
+    <ds:schemaRef ds:uri="http://schemas.openxmlformats.org/officeDocument/2006/bibliography"/>
+  </ds:schemaRefs>
+</ds:datastoreItem>
+</file>
+
+<file path=customXml/itemProps3.xml><?xml version="1.0" encoding="utf-8"?>
+<ds:datastoreItem xmlns:ds="http://schemas.openxmlformats.org/officeDocument/2006/customXml" ds:itemID="{8E9DE294-534C-4BFB-8111-CAF01004D4DD}">
+  <ds:schemaRefs>
+    <ds:schemaRef ds:uri="http://schemas.microsoft.com/sharepoint/v3/contenttype/forms"/>
+  </ds:schemaRefs>
+</ds:datastoreItem>
+</file>
+
+<file path=customXml/itemProps4.xml><?xml version="1.0" encoding="utf-8"?>
+<ds:datastoreItem xmlns:ds="http://schemas.openxmlformats.org/officeDocument/2006/customXml" ds:itemID="{7883E2C3-CCE1-4717-BE5E-8B1D565F3415}">
+  <ds:schemaRefs>
+    <ds:schemaRef ds:uri="http://schemas.microsoft.com/office/2006/metadata/properties"/>
+    <ds:schemaRef ds:uri="http://schemas.microsoft.com/office/infopath/2007/PartnerControls"/>
+    <ds:schemaRef ds:uri="356e901f-47eb-47ce-8e66-808e6286e49f"/>
+    <ds:schemaRef ds:uri="31ff94d2-d6de-4560-8208-d596f4cc19da"/>
+  </ds:schemaRefs>
+</ds:datastoreItem>
 </file>
</xml_diff>